<commit_message>
Some docs updated and  some screens, added.
</commit_message>
<xml_diff>
--- a/Condominium-System/Docs/Requirements/Data Dictionary - Condominium System.docx
+++ b/Condominium-System/Docs/Requirements/Data Dictionary - Condominium System.docx
@@ -49,16 +49,16 @@
         <w:gridCol w:w="1170"/>
         <w:gridCol w:w="2100"/>
         <w:gridCol w:w="1530"/>
-        <w:gridCol w:w="1230"/>
-        <w:gridCol w:w="840"/>
+        <w:gridCol w:w="930"/>
+        <w:gridCol w:w="1140"/>
         <w:gridCol w:w="4275"/>
         <w:tblGridChange w:id="0">
           <w:tblGrid>
             <w:gridCol w:w="1170"/>
             <w:gridCol w:w="2100"/>
             <w:gridCol w:w="1530"/>
-            <w:gridCol w:w="1230"/>
-            <w:gridCol w:w="840"/>
+            <w:gridCol w:w="930"/>
+            <w:gridCol w:w="1140"/>
             <w:gridCol w:w="4275"/>
           </w:tblGrid>
         </w:tblGridChange>
@@ -601,7 +601,7 @@
               <w:rPr>
                 <w:rtl w:val="0"/>
               </w:rPr>
-              <w:t xml:space="preserve">Clave primaria de identificación del condominio</w:t>
+              <w:t xml:space="preserve">Clave primaria de identificación del condominio. Se genera automáticamente.</w:t>
             </w:r>
           </w:p>
         </w:tc>
@@ -3078,7 +3078,7 @@
               <w:rPr>
                 <w:rtl w:val="0"/>
               </w:rPr>
-              <w:t xml:space="preserve">Clave primaria de identificación del condominio</w:t>
+              <w:t xml:space="preserve">Clave primaria de identificación del condominio. Se genera automáticamente.</w:t>
             </w:r>
           </w:p>
         </w:tc>
@@ -4012,7 +4012,7 @@
               <w:rPr>
                 <w:rtl w:val="0"/>
               </w:rPr>
-              <w:t xml:space="preserve">Clave foránea del condominio.</w:t>
+              <w:t xml:space="preserve">Clave foránea que se entrelaza con la tabla de condominio.</w:t>
             </w:r>
           </w:p>
         </w:tc>
@@ -5271,7 +5271,7 @@
               <w:rPr>
                 <w:rtl w:val="0"/>
               </w:rPr>
-              <w:t xml:space="preserve">Clave primaria de identificación del mobiliario</w:t>
+              <w:t xml:space="preserve">Clave primaria de identificación del mobiliario. Se genere automáticamente.</w:t>
             </w:r>
           </w:p>
         </w:tc>
@@ -7000,7 +7000,7 @@
               <w:rPr>
                 <w:rtl w:val="0"/>
               </w:rPr>
-              <w:t xml:space="preserve">Clave primaria de identificación de la vivienda.</w:t>
+              <w:t xml:space="preserve">Clave primaria de identificación de la vivienda. Se genera automáticamente.</w:t>
             </w:r>
           </w:p>
         </w:tc>
@@ -7780,7 +7780,7 @@
               <w:rPr>
                 <w:rtl w:val="0"/>
               </w:rPr>
-              <w:t xml:space="preserve">Clave foránea del condominio.</w:t>
+              <w:t xml:space="preserve">Clave foránea que se entrelaza con la tabla de bloque.</w:t>
             </w:r>
           </w:p>
         </w:tc>
@@ -9038,7 +9038,7 @@
               <w:rPr>
                 <w:rtl w:val="0"/>
               </w:rPr>
-              <w:t xml:space="preserve">Clave foránea de la vivienda.</w:t>
+              <w:t xml:space="preserve">Clave foránea que se entrelaza con la tabla de vivienda y constituye parte de la clave principal. </w:t>
             </w:r>
           </w:p>
         </w:tc>
@@ -9197,7 +9197,7 @@
               <w:rPr>
                 <w:rtl w:val="0"/>
               </w:rPr>
-              <w:t xml:space="preserve">Clave foránea del mobiliario.</w:t>
+              <w:t xml:space="preserve">Clave foránea que se entrelaza con la tabla de mobiliario y constituye parte de la clave principal. </w:t>
             </w:r>
           </w:p>
         </w:tc>
@@ -10461,7 +10461,7 @@
               <w:rPr>
                 <w:rtl w:val="0"/>
               </w:rPr>
-              <w:t xml:space="preserve">Clave foránea de la vivienda.</w:t>
+              <w:t xml:space="preserve">Clave foránea que se entrelaza con la tabla de vivienda y constituye parte de la clave principal. </w:t>
             </w:r>
           </w:p>
         </w:tc>
@@ -10620,7 +10620,7 @@
               <w:rPr>
                 <w:rtl w:val="0"/>
               </w:rPr>
-              <w:t xml:space="preserve">Clave foránea del servicio.</w:t>
+              <w:t xml:space="preserve">Clave foránea que se entrelaza con la tabla de servicios y constituye parte de la clave principal. </w:t>
             </w:r>
           </w:p>
         </w:tc>
@@ -11895,7 +11895,7 @@
               <w:rPr>
                 <w:rtl w:val="0"/>
               </w:rPr>
-              <w:t xml:space="preserve">Clave primaria de identificación del incidente.</w:t>
+              <w:t xml:space="preserve">Clave primaria de identificación del incidente. Se genera automáticamente.</w:t>
             </w:r>
           </w:p>
         </w:tc>
@@ -12367,7 +12367,7 @@
               <w:rPr>
                 <w:rtl w:val="0"/>
               </w:rPr>
-              <w:t xml:space="preserve">Clave foránea del propietario.</w:t>
+              <w:t xml:space="preserve">Clave foránea que se entrelaza con la tabla de propietario.</w:t>
             </w:r>
           </w:p>
         </w:tc>
@@ -13477,7 +13477,7 @@
               <w:rPr>
                 <w:rtl w:val="0"/>
               </w:rPr>
-              <w:t xml:space="preserve">Clave primaria de identificación del incidente.</w:t>
+              <w:t xml:space="preserve">Clave primaria de identificación del incidente. Se genera automáticamente.</w:t>
             </w:r>
           </w:p>
         </w:tc>
@@ -13950,6 +13950,7 @@
       <w:tr>
         <w:trPr>
           <w:cantSplit w:val="0"/>
+          <w:trHeight w:val="447.978515625" w:hRule="atLeast"/>
           <w:tblHeader w:val="0"/>
         </w:trPr>
         <w:tc>
@@ -14104,7 +14105,7 @@
               <w:rPr>
                 <w:rtl w:val="0"/>
               </w:rPr>
-              <w:t xml:space="preserve">Clave foránea del propietario.</w:t>
+              <w:t xml:space="preserve">Clave foránea que se entrelaza con la tabla de propietario.</w:t>
             </w:r>
           </w:p>
         </w:tc>
@@ -15275,7 +15276,7 @@
               <w:rPr>
                 <w:rtl w:val="0"/>
               </w:rPr>
-              <w:t xml:space="preserve">Clave primaria de identificación del mobiliario</w:t>
+              <w:t xml:space="preserve">Clave primaria de identificación del mobiliario. Se genera automaticamente.</w:t>
             </w:r>
           </w:p>
         </w:tc>
@@ -17155,7 +17156,7 @@
               <w:rPr>
                 <w:rtl w:val="0"/>
               </w:rPr>
-              <w:t xml:space="preserve">Clave primaria de identificación del propietario</w:t>
+              <w:t xml:space="preserve">Clave primaria de identificación del propietario. Se genera automáticamente.</w:t>
             </w:r>
           </w:p>
         </w:tc>
@@ -18399,7 +18400,7 @@
               <w:rPr>
                 <w:rtl w:val="0"/>
               </w:rPr>
-              <w:t xml:space="preserve">Clave foránea de la vivienda.</w:t>
+              <w:t xml:space="preserve">Clave foránea que se entrelaza con la tabla de vivienda.</w:t>
             </w:r>
           </w:p>
         </w:tc>
@@ -19660,7 +19661,7 @@
               <w:rPr>
                 <w:rtl w:val="0"/>
               </w:rPr>
-              <w:t xml:space="preserve">Clave primaria de identificación del usuario.</w:t>
+              <w:t xml:space="preserve">Clave primaria de identificación del usuario. Se genera automaticamente.</w:t>
             </w:r>
           </w:p>
         </w:tc>
@@ -20904,7 +20905,7 @@
               <w:rPr>
                 <w:rtl w:val="0"/>
               </w:rPr>
-              <w:t xml:space="preserve">Clave foránea del condominio.</w:t>
+              <w:t xml:space="preserve">Clave foránea que se entrelaza con la tabla de Condominio.</w:t>
             </w:r>
           </w:p>
         </w:tc>
@@ -22233,7 +22234,7 @@
               <w:rPr>
                 <w:rtl w:val="0"/>
               </w:rPr>
-              <w:t xml:space="preserve">Clave primaria de identificación del recibo.</w:t>
+              <w:t xml:space="preserve">Clave primaria de identificación del recibo. Se genera automáticamente.</w:t>
             </w:r>
           </w:p>
         </w:tc>
@@ -22395,7 +22396,7 @@
               <w:rPr>
                 <w:rtl w:val="0"/>
               </w:rPr>
-              <w:t xml:space="preserve">Clave foránea del propietario.</w:t>
+              <w:t xml:space="preserve">Clave foránea que se entrelaza con la tabla de propietario.</w:t>
             </w:r>
           </w:p>
         </w:tc>
@@ -22557,7 +22558,7 @@
               <w:rPr>
                 <w:rtl w:val="0"/>
               </w:rPr>
-              <w:t xml:space="preserve">Clave foránea de la vivienda.</w:t>
+              <w:t xml:space="preserve">Clave foránea que se entrelaza con la tabla de vivienda.</w:t>
             </w:r>
           </w:p>
         </w:tc>
@@ -24590,7 +24591,7 @@
               <w:rPr>
                 <w:rtl w:val="0"/>
               </w:rPr>
-              <w:t xml:space="preserve">Clave primaria de identificación del pago.</w:t>
+              <w:t xml:space="preserve">Clave primaria de identificación del pago. Se genera automáticamente.</w:t>
             </w:r>
           </w:p>
         </w:tc>
@@ -25226,7 +25227,7 @@
               <w:rPr>
                 <w:rtl w:val="0"/>
               </w:rPr>
-              <w:t xml:space="preserve">Clave foránea del recibo.</w:t>
+              <w:t xml:space="preserve">Clave foránea que se entrelaza con la tabla del recibo.</w:t>
             </w:r>
           </w:p>
         </w:tc>

</xml_diff>